<commit_message>
changed minimum and maximum age to min and max class, adjusted layout for kalender
</commit_message>
<xml_diff>
--- a/wwwroot/configsheets/Informationen/0 Information.docx
+++ b/wwwroot/configsheets/Informationen/0 Information.docx
@@ -16,7 +16,55 @@
           <w:bCs/>
           <w:color w:val="EE0000"/>
         </w:rPr>
-        <w:t>19. FERIENSPASS 22.-26. September 2025</w:t>
+        <w:t>20</w:t>
+      </w:r>
+      <w:r>
+        <w:rPr>
+          <w:b/>
+          <w:bCs/>
+          <w:color w:val="EE0000"/>
+        </w:rPr>
+        <w:t>. FERIENSPASS 2</w:t>
+      </w:r>
+      <w:r>
+        <w:rPr>
+          <w:b/>
+          <w:bCs/>
+          <w:color w:val="EE0000"/>
+        </w:rPr>
+        <w:t>1</w:t>
+      </w:r>
+      <w:r>
+        <w:rPr>
+          <w:b/>
+          <w:bCs/>
+          <w:color w:val="EE0000"/>
+        </w:rPr>
+        <w:t>.-2</w:t>
+      </w:r>
+      <w:r>
+        <w:rPr>
+          <w:b/>
+          <w:bCs/>
+          <w:color w:val="EE0000"/>
+        </w:rPr>
+        <w:t>5</w:t>
+      </w:r>
+      <w:r>
+        <w:rPr>
+          <w:b/>
+          <w:bCs/>
+          <w:color w:val="EE0000"/>
+        </w:rPr>
+        <w:t>. September 202</w:t>
+      </w:r>
+      <w:r>
+        <w:rPr>
+          <w:b/>
+          <w:bCs/>
+          <w:color w:val="EE0000"/>
+        </w:rPr>
+        <w:t>6</w:t>
       </w:r>
     </w:p>
     <w:p>
@@ -38,7 +86,49 @@
           <w:b/>
           <w:bCs/>
         </w:rPr>
-        <w:t>Anmeldungen ab: Samstag, 23. August 2025 ab 8. 00 Uhr</w:t>
+        <w:t xml:space="preserve">Anmeldungen ab: Samstag, </w:t>
+      </w:r>
+      <w:r>
+        <w:rPr>
+          <w:b/>
+          <w:bCs/>
+        </w:rPr>
+        <w:t>15</w:t>
+      </w:r>
+      <w:r>
+        <w:rPr>
+          <w:b/>
+          <w:bCs/>
+        </w:rPr>
+        <w:t>. August 202</w:t>
+      </w:r>
+      <w:r>
+        <w:rPr>
+          <w:b/>
+          <w:bCs/>
+        </w:rPr>
+        <w:t>6</w:t>
+      </w:r>
+      <w:r>
+        <w:rPr>
+          <w:b/>
+          <w:bCs/>
+        </w:rPr>
+        <w:t xml:space="preserve"> ab </w:t>
+      </w:r>
+      <w:r>
+        <w:rPr>
+          <w:b/>
+          <w:bCs/>
+        </w:rPr>
+        <w:t>06</w:t>
+      </w:r>
+      <w:r>
+        <w:rPr>
+          <w:b/>
+          <w:bCs/>
+        </w:rPr>
+        <w:t>. 00 Uhr</w:t>
       </w:r>
     </w:p>
     <w:p>
@@ -56,7 +146,63 @@
           <w:b/>
           <w:bCs/>
         </w:rPr>
-        <w:t>Anmeldeschluss: Samstag, 06. September 2025 23:00!</w:t>
+        <w:t xml:space="preserve">Anmeldeschluss: Samstag, </w:t>
+      </w:r>
+      <w:r>
+        <w:rPr>
+          <w:b/>
+          <w:bCs/>
+        </w:rPr>
+        <w:t>29</w:t>
+      </w:r>
+      <w:r>
+        <w:rPr>
+          <w:b/>
+          <w:bCs/>
+        </w:rPr>
+        <w:t xml:space="preserve">. </w:t>
+      </w:r>
+      <w:r>
+        <w:rPr>
+          <w:b/>
+          <w:bCs/>
+        </w:rPr>
+        <w:t>August</w:t>
+      </w:r>
+      <w:r>
+        <w:rPr>
+          <w:b/>
+          <w:bCs/>
+        </w:rPr>
+        <w:t xml:space="preserve"> 202</w:t>
+      </w:r>
+      <w:r>
+        <w:rPr>
+          <w:b/>
+          <w:bCs/>
+        </w:rPr>
+        <w:t>6</w:t>
+      </w:r>
+      <w:r>
+        <w:rPr>
+          <w:b/>
+          <w:bCs/>
+        </w:rPr>
+        <w:t xml:space="preserve"> </w:t>
+      </w:r>
+      <w:r>
+        <w:rPr>
+          <w:b/>
+          <w:bCs/>
+        </w:rPr>
+        <w:t>20</w:t>
+      </w:r>
+      <w:r>
+        <w:rPr>
+          <w:b/>
+          <w:bCs/>
+        </w:rPr>
+        <w:t>:00!</w:t>
       </w:r>
     </w:p>
     <w:p>
@@ -68,7 +214,28 @@
           <w:b/>
           <w:bCs/>
         </w:rPr>
-        <w:t>Bezahlung bis: Freitag 19. September 2025</w:t>
+        <w:t>Bezahlung bis: Freitag 1</w:t>
+      </w:r>
+      <w:r>
+        <w:rPr>
+          <w:b/>
+          <w:bCs/>
+        </w:rPr>
+        <w:t>1</w:t>
+      </w:r>
+      <w:r>
+        <w:rPr>
+          <w:b/>
+          <w:bCs/>
+        </w:rPr>
+        <w:t>. September 202</w:t>
+      </w:r>
+      <w:r>
+        <w:rPr>
+          <w:b/>
+          <w:bCs/>
+        </w:rPr>
+        <w:t>6</w:t>
       </w:r>
     </w:p>
     <w:p/>

</xml_diff>